<commit_message>
Clarify dependency guidance and session reporting
</commit_message>
<xml_diff>
--- a/products/manuscript/manuscript.docx
+++ b/products/manuscript/manuscript.docx
@@ -2477,17 +2477,276 @@
     </w:p>
     <w:bookmarkEnd w:id="38"/>
     <w:bookmarkEnd w:id="39"/>
-    <w:bookmarkStart w:id="47" w:name="references"/>
+    <w:bookmarkStart w:id="40" w:name="software-and-session-information"/>
     <w:p>
       <w:pPr>
         <w:pStyle w:val="Heading1"/>
       </w:pPr>
       <w:r>
-        <w:t xml:space="preserve">6. References</w:t>
-      </w:r>
-    </w:p>
-    <w:bookmarkStart w:id="46" w:name="refs"/>
-    <w:bookmarkStart w:id="41" w:name="ref-mckay2020"/>
+        <w:t xml:space="preserve">6. Software and Session Information</w:t>
+      </w:r>
+    </w:p>
+    <w:p>
+      <w:pPr>
+        <w:pStyle w:val="FirstParagraph"/>
+      </w:pPr>
+      <w:r>
+        <w:t xml:space="preserve">The chunk below is optional. It records the R version, platform, and loaded</w:t>
+      </w:r>
+      <w:r>
+        <w:t xml:space="preserve"> </w:t>
+      </w:r>
+      <w:r>
+        <w:t xml:space="preserve">package versions used when the manuscript was rendered. This is a lightweight</w:t>
+      </w:r>
+      <w:r>
+        <w:t xml:space="preserve"> </w:t>
+      </w:r>
+      <w:r>
+        <w:t xml:space="preserve">way to help collaborators understand the computing environment without requiring</w:t>
+      </w:r>
+      <w:r>
+        <w:t xml:space="preserve"> </w:t>
+      </w:r>
+      <w:r>
+        <w:t xml:space="preserve">a full environment manager.</w:t>
+      </w:r>
+    </w:p>
+    <w:p>
+      <w:pPr>
+        <w:pStyle w:val="SourceCode"/>
+      </w:pPr>
+      <w:r>
+        <w:rPr>
+          <w:rStyle w:val="VerbatimChar"/>
+        </w:rPr>
+        <w:t xml:space="preserve">R version 4.6.0 (2026-04-24 ucrt)</w:t>
+      </w:r>
+      <w:r>
+        <w:br/>
+      </w:r>
+      <w:r>
+        <w:rPr>
+          <w:rStyle w:val="VerbatimChar"/>
+        </w:rPr>
+        <w:t xml:space="preserve">Platform: x86_64-w64-mingw32/x64</w:t>
+      </w:r>
+      <w:r>
+        <w:br/>
+      </w:r>
+      <w:r>
+        <w:rPr>
+          <w:rStyle w:val="VerbatimChar"/>
+        </w:rPr>
+        <w:t xml:space="preserve">Running under: Windows 11 x64 (build 26200)</w:t>
+      </w:r>
+      <w:r>
+        <w:br/>
+      </w:r>
+      <w:r>
+        <w:br/>
+      </w:r>
+      <w:r>
+        <w:rPr>
+          <w:rStyle w:val="VerbatimChar"/>
+        </w:rPr>
+        <w:t xml:space="preserve">Matrix products: default</w:t>
+      </w:r>
+      <w:r>
+        <w:br/>
+      </w:r>
+      <w:r>
+        <w:rPr>
+          <w:rStyle w:val="VerbatimChar"/>
+        </w:rPr>
+        <w:t xml:space="preserve">  LAPACK version 3.12.1</w:t>
+      </w:r>
+      <w:r>
+        <w:br/>
+      </w:r>
+      <w:r>
+        <w:br/>
+      </w:r>
+      <w:r>
+        <w:rPr>
+          <w:rStyle w:val="VerbatimChar"/>
+        </w:rPr>
+        <w:t xml:space="preserve">locale:</w:t>
+      </w:r>
+      <w:r>
+        <w:br/>
+      </w:r>
+      <w:r>
+        <w:rPr>
+          <w:rStyle w:val="VerbatimChar"/>
+        </w:rPr>
+        <w:t xml:space="preserve">[1] LC_COLLATE=English_United States.utf8</w:t>
+      </w:r>
+      <w:r>
+        <w:br/>
+      </w:r>
+      <w:r>
+        <w:rPr>
+          <w:rStyle w:val="VerbatimChar"/>
+        </w:rPr>
+        <w:t xml:space="preserve">[2] LC_CTYPE=English_United States.utf8</w:t>
+      </w:r>
+      <w:r>
+        <w:br/>
+      </w:r>
+      <w:r>
+        <w:rPr>
+          <w:rStyle w:val="VerbatimChar"/>
+        </w:rPr>
+        <w:t xml:space="preserve">[3] LC_MONETARY=English_United States.utf8</w:t>
+      </w:r>
+      <w:r>
+        <w:br/>
+      </w:r>
+      <w:r>
+        <w:rPr>
+          <w:rStyle w:val="VerbatimChar"/>
+        </w:rPr>
+        <w:t xml:space="preserve">[4] LC_NUMERIC=C</w:t>
+      </w:r>
+      <w:r>
+        <w:br/>
+      </w:r>
+      <w:r>
+        <w:rPr>
+          <w:rStyle w:val="VerbatimChar"/>
+        </w:rPr>
+        <w:t xml:space="preserve">[5] LC_TIME=English_United States.utf8</w:t>
+      </w:r>
+      <w:r>
+        <w:br/>
+      </w:r>
+      <w:r>
+        <w:br/>
+      </w:r>
+      <w:r>
+        <w:rPr>
+          <w:rStyle w:val="VerbatimChar"/>
+        </w:rPr>
+        <w:t xml:space="preserve">time zone: America/New_York</w:t>
+      </w:r>
+      <w:r>
+        <w:br/>
+      </w:r>
+      <w:r>
+        <w:rPr>
+          <w:rStyle w:val="VerbatimChar"/>
+        </w:rPr>
+        <w:t xml:space="preserve">tzcode source: internal</w:t>
+      </w:r>
+      <w:r>
+        <w:br/>
+      </w:r>
+      <w:r>
+        <w:br/>
+      </w:r>
+      <w:r>
+        <w:rPr>
+          <w:rStyle w:val="VerbatimChar"/>
+        </w:rPr>
+        <w:t xml:space="preserve">attached base packages:</w:t>
+      </w:r>
+      <w:r>
+        <w:br/>
+      </w:r>
+      <w:r>
+        <w:rPr>
+          <w:rStyle w:val="VerbatimChar"/>
+        </w:rPr>
+        <w:t xml:space="preserve">[1] stats     graphics  grDevices utils     datasets  methods   base</w:t>
+      </w:r>
+      <w:r>
+        <w:br/>
+      </w:r>
+      <w:r>
+        <w:br/>
+      </w:r>
+      <w:r>
+        <w:rPr>
+          <w:rStyle w:val="VerbatimChar"/>
+        </w:rPr>
+        <w:t xml:space="preserve">other attached packages:</w:t>
+      </w:r>
+      <w:r>
+        <w:br/>
+      </w:r>
+      <w:r>
+        <w:rPr>
+          <w:rStyle w:val="VerbatimChar"/>
+        </w:rPr>
+        <w:t xml:space="preserve">[1] knitr_1.51 here_1.0.2</w:t>
+      </w:r>
+      <w:r>
+        <w:br/>
+      </w:r>
+      <w:r>
+        <w:br/>
+      </w:r>
+      <w:r>
+        <w:rPr>
+          <w:rStyle w:val="VerbatimChar"/>
+        </w:rPr>
+        <w:t xml:space="preserve">loaded via a namespace (and not attached):</w:t>
+      </w:r>
+      <w:r>
+        <w:br/>
+      </w:r>
+      <w:r>
+        <w:rPr>
+          <w:rStyle w:val="VerbatimChar"/>
+        </w:rPr>
+        <w:t xml:space="preserve"> [1] compiler_4.6.0  fastmap_1.2.0   rprojroot_2.1.1 cli_3.6.6</w:t>
+      </w:r>
+      <w:r>
+        <w:br/>
+      </w:r>
+      <w:r>
+        <w:rPr>
+          <w:rStyle w:val="VerbatimChar"/>
+        </w:rPr>
+        <w:t xml:space="preserve"> [5] tools_4.6.0     htmltools_0.5.9 otel_0.2.0      yaml_2.3.12</w:t>
+      </w:r>
+      <w:r>
+        <w:br/>
+      </w:r>
+      <w:r>
+        <w:rPr>
+          <w:rStyle w:val="VerbatimChar"/>
+        </w:rPr>
+        <w:t xml:space="preserve"> [9] rmarkdown_2.31  jsonlite_2.0.0  xfun_0.58       digest_0.6.39</w:t>
+      </w:r>
+      <w:r>
+        <w:br/>
+      </w:r>
+      <w:r>
+        <w:rPr>
+          <w:rStyle w:val="VerbatimChar"/>
+        </w:rPr>
+        <w:t xml:space="preserve">[13] rlang_1.2.0     evaluate_1.0.5</w:t>
+      </w:r>
+    </w:p>
+    <w:p>
+      <w:r>
+        <w:br w:type="page"/>
+      </w:r>
+    </w:p>
+    <w:bookmarkEnd w:id="40"/>
+    <w:bookmarkStart w:id="48" w:name="references"/>
+    <w:p>
+      <w:pPr>
+        <w:pStyle w:val="Heading1"/>
+      </w:pPr>
+      <w:r>
+        <w:t xml:space="preserve">7. References</w:t>
+      </w:r>
+    </w:p>
+    <w:bookmarkStart w:id="47" w:name="refs"/>
+    <w:bookmarkStart w:id="42" w:name="ref-mckay2020"/>
     <w:p>
       <w:pPr>
         <w:pStyle w:val="Bibliography"/>
@@ -2507,7 +2766,7 @@
       <w:r>
         <w:t xml:space="preserve"> </w:t>
       </w:r>
-      <w:hyperlink r:id="rId40">
+      <w:hyperlink r:id="rId41">
         <w:r>
           <w:rPr>
             <w:rStyle w:val="Hyperlink"/>
@@ -2622,8 +2881,8 @@
         <w:t xml:space="preserve"> </w:t>
       </w:r>
     </w:p>
-    <w:bookmarkEnd w:id="41"/>
-    <w:bookmarkStart w:id="43" w:name="ref-mckay2020a"/>
+    <w:bookmarkEnd w:id="42"/>
+    <w:bookmarkStart w:id="44" w:name="ref-mckay2020a"/>
     <w:p>
       <w:pPr>
         <w:pStyle w:val="Bibliography"/>
@@ -2643,7 +2902,7 @@
       <w:r>
         <w:t xml:space="preserve"> </w:t>
       </w:r>
-      <w:hyperlink r:id="rId42">
+      <w:hyperlink r:id="rId43">
         <w:r>
           <w:rPr>
             <w:rStyle w:val="Hyperlink"/>
@@ -2668,8 +2927,8 @@
         <w:t xml:space="preserve"> </w:t>
       </w:r>
     </w:p>
-    <w:bookmarkEnd w:id="43"/>
-    <w:bookmarkStart w:id="45" w:name="ref-leek2015"/>
+    <w:bookmarkEnd w:id="44"/>
+    <w:bookmarkStart w:id="46" w:name="ref-leek2015"/>
     <w:p>
       <w:pPr>
         <w:pStyle w:val="Bibliography"/>
@@ -2689,7 +2948,7 @@
       <w:r>
         <w:t xml:space="preserve"> </w:t>
       </w:r>
-      <w:hyperlink r:id="rId44">
+      <w:hyperlink r:id="rId45">
         <w:r>
           <w:rPr>
             <w:rStyle w:val="Hyperlink"/>
@@ -2738,9 +2997,9 @@
         <w:t xml:space="preserve"> </w:t>
       </w:r>
     </w:p>
-    <w:bookmarkEnd w:id="45"/>
     <w:bookmarkEnd w:id="46"/>
     <w:bookmarkEnd w:id="47"/>
+    <w:bookmarkEnd w:id="48"/>
     <w:sectPr>
       <w:footnotePr>
         <w:numRestart w:val="eachSect"/>

</xml_diff>

<commit_message>
Prepare template for human review
</commit_message>
<xml_diff>
--- a/products/manuscript/manuscript.docx
+++ b/products/manuscript/manuscript.docx
@@ -333,7 +333,7 @@
         <w:t xml:space="preserve"> </w:t>
       </w:r>
       <w:r>
-        <w:t xml:space="preserve">Corresponding author: some@email.com</w:t>
+        <w:t xml:space="preserve">Corresponding author: corresponding-author@example.com</w:t>
       </w:r>
     </w:p>
     <w:p>
@@ -546,7 +546,7 @@
         <w:pStyle w:val="FirstParagraph"/>
       </w:pPr>
       <w:r>
-        <w:t xml:space="preserve">Sometimes you might want to show a schematic diagram/figure that was not created with code (if you can do it with code, do it).</w:t>
+        <w:t xml:space="preserve">Sometimes you might want to show a schematic diagram or figure that was created outside the analysis code, for example a conceptual overview figure.</w:t>
       </w:r>
       <w:r>
         <w:t xml:space="preserve"> </w:t>
@@ -563,13 +563,13 @@
         <w:t xml:space="preserve"> </w:t>
       </w:r>
       <w:r>
-        <w:t xml:space="preserve">is an example of some - completely random/unrelated - schematic that was generated with BioRender.</w:t>
-      </w:r>
-      <w:r>
-        <w:t xml:space="preserve"> </w:t>
-      </w:r>
-      <w:r>
-        <w:t xml:space="preserve">We store those figures in the</w:t>
+        <w:t xml:space="preserve">shows an example schematic.</w:t>
+      </w:r>
+      <w:r>
+        <w:t xml:space="preserve"> </w:t>
+      </w:r>
+      <w:r>
+        <w:t xml:space="preserve">Store manually created figures in the</w:t>
       </w:r>
       <w:r>
         <w:t xml:space="preserve"> </w:t>
@@ -584,7 +584,7 @@
         <w:t xml:space="preserve"> </w:t>
       </w:r>
       <w:r>
-        <w:t xml:space="preserve">folder.</w:t>
+        <w:t xml:space="preserve">folder and document their source.</w:t>
       </w:r>
     </w:p>
     <w:tbl>
@@ -659,7 +659,7 @@
               <w:pStyle w:val="ImageCaption"/>
             </w:pPr>
             <w:r>
-              <w:t xml:space="preserve">Figure 1: A figure that is manually generated and shows some overview/schematic. This has nothing to do with the data, it’s just a random one from one of our projects I found and placed here.</w:t>
+              <w:t xml:space="preserve">Figure 1: Example manually created schematic figure. Replace this with a project-specific figure and caption.</w:t>
             </w:r>
           </w:p>
           <w:bookmarkEnd w:id="19"/>
@@ -849,7 +849,7 @@
         <w:rPr>
           <w:rStyle w:val="VerbatimChar"/>
         </w:rPr>
-        <w:t xml:space="preserve">C:\ahandel\myproject\results\</w:t>
+        <w:t xml:space="preserve">C:\path\to\project\results\</w:t>
       </w:r>
       <w:r>
         <w:t xml:space="preserve"> </w:t>

</xml_diff>

<commit_message>
AI: Replace example schematic figure
</commit_message>
<xml_diff>
--- a/products/manuscript/manuscript.docx
+++ b/products/manuscript/manuscript.docx
@@ -609,14 +609,14 @@
             <w:r>
               <w:drawing>
                 <wp:inline>
-                  <wp:extent cx="5334000" cy="4978399"/>
+                  <wp:extent cx="5334000" cy="2963333"/>
                   <wp:effectExtent b="0" l="0" r="0" t="0"/>
                   <wp:docPr descr="" title="" id="17" name="Picture"/>
                   <a:graphic>
                     <a:graphicData uri="http://schemas.openxmlformats.org/drawingml/2006/picture">
                       <pic:pic>
                         <pic:nvPicPr>
-                          <pic:cNvPr descr="../../assets/antigen-recognition.png" id="18" name="Picture"/>
+                          <pic:cNvPr descr="../../assets/schematic-example.png" id="18" name="Picture"/>
                           <pic:cNvPicPr>
                             <a:picLocks noChangeArrowheads="1" noChangeAspect="1"/>
                           </pic:cNvPicPr>
@@ -630,7 +630,7 @@
                         <pic:spPr bwMode="auto">
                           <a:xfrm>
                             <a:off x="0" y="0"/>
-                            <a:ext cx="5334000" cy="4978399"/>
+                            <a:ext cx="5334000" cy="2963333"/>
                           </a:xfrm>
                           <a:prstGeom prst="rect">
                             <a:avLst/>

</xml_diff>